<commit_message>
RCURSOS Y DOCUMENTACION COMPLETA
</commit_message>
<xml_diff>
--- a/Proyecto/docs/ADS_ConsultasProyecto_AndresFabara_JoshuaOsorio.docx
+++ b/Proyecto/docs/ADS_ConsultasProyecto_AndresFabara_JoshuaOsorio.docx
@@ -471,6 +471,10 @@
     <w:sdt>
       <w:sdtPr>
         <w:rPr>
+          <w:rFonts w:ascii="Arial" w:eastAsia="Arial" w:hAnsi="Arial" w:cs="Arial"/>
+          <w:color w:val="auto"/>
+          <w:sz w:val="22"/>
+          <w:szCs w:val="22"/>
           <w:lang w:val="es-ES"/>
         </w:rPr>
         <w:id w:val="1933626208"/>
@@ -481,12 +485,8 @@
       </w:sdtPr>
       <w:sdtEndPr>
         <w:rPr>
-          <w:rFonts w:ascii="Arial" w:eastAsia="Arial" w:hAnsi="Arial" w:cs="Arial"/>
           <w:b/>
           <w:bCs/>
-          <w:color w:val="auto"/>
-          <w:sz w:val="22"/>
-          <w:szCs w:val="22"/>
         </w:rPr>
       </w:sdtEndPr>
       <w:sdtContent>
@@ -513,7 +513,7 @@
               <w:kern w:val="2"/>
               <w:sz w:val="24"/>
               <w:szCs w:val="24"/>
-              <w:lang w:val="es-MX" w:eastAsia="es-MX"/>
+              <w:lang w:val="en-US"/>
               <w14:ligatures w14:val="standardContextual"/>
             </w:rPr>
           </w:pPr>
@@ -526,7 +526,7 @@
           <w:r>
             <w:fldChar w:fldCharType="separate"/>
           </w:r>
-          <w:hyperlink w:anchor="_Toc226928504" w:history="1">
+          <w:hyperlink w:anchor="_Toc227703684" w:history="1">
             <w:r>
               <w:rPr>
                 <w:rStyle w:val="Hipervnculo"/>
@@ -557,7 +557,7 @@
                 <w:noProof/>
                 <w:webHidden/>
               </w:rPr>
-              <w:instrText xml:space="preserve"> PAGEREF _Toc226928504 \h </w:instrText>
+              <w:instrText xml:space="preserve"> PAGEREF _Toc227703684 \h </w:instrText>
             </w:r>
             <w:r>
               <w:rPr>
@@ -601,11 +601,11 @@
               <w:kern w:val="2"/>
               <w:sz w:val="24"/>
               <w:szCs w:val="24"/>
-              <w:lang w:val="es-MX" w:eastAsia="es-MX"/>
+              <w:lang w:val="en-US"/>
               <w14:ligatures w14:val="standardContextual"/>
             </w:rPr>
           </w:pPr>
-          <w:hyperlink w:anchor="_Toc226928505" w:history="1">
+          <w:hyperlink w:anchor="_Toc227703685" w:history="1">
             <w:r>
               <w:rPr>
                 <w:rStyle w:val="Hipervnculo"/>
@@ -624,7 +624,7 @@
                 <w:kern w:val="2"/>
                 <w:sz w:val="24"/>
                 <w:szCs w:val="24"/>
-                <w:lang w:val="es-MX" w:eastAsia="es-MX"/>
+                <w:lang w:val="en-US"/>
                 <w14:ligatures w14:val="standardContextual"/>
               </w:rPr>
               <w:tab/>
@@ -659,7 +659,7 @@
                 <w:noProof/>
                 <w:webHidden/>
               </w:rPr>
-              <w:instrText xml:space="preserve"> PAGEREF _Toc226928505 \h </w:instrText>
+              <w:instrText xml:space="preserve"> PAGEREF _Toc227703685 \h </w:instrText>
             </w:r>
             <w:r>
               <w:rPr>
@@ -703,11 +703,11 @@
               <w:kern w:val="2"/>
               <w:sz w:val="24"/>
               <w:szCs w:val="24"/>
-              <w:lang w:val="es-MX" w:eastAsia="es-MX"/>
+              <w:lang w:val="en-US"/>
               <w14:ligatures w14:val="standardContextual"/>
             </w:rPr>
           </w:pPr>
-          <w:hyperlink w:anchor="_Toc226928506" w:history="1">
+          <w:hyperlink w:anchor="_Toc227703686" w:history="1">
             <w:r>
               <w:rPr>
                 <w:rStyle w:val="Hipervnculo"/>
@@ -726,7 +726,7 @@
                 <w:kern w:val="2"/>
                 <w:sz w:val="24"/>
                 <w:szCs w:val="24"/>
-                <w:lang w:val="es-MX" w:eastAsia="es-MX"/>
+                <w:lang w:val="en-US"/>
                 <w14:ligatures w14:val="standardContextual"/>
               </w:rPr>
               <w:tab/>
@@ -761,7 +761,7 @@
                 <w:noProof/>
                 <w:webHidden/>
               </w:rPr>
-              <w:instrText xml:space="preserve"> PAGEREF _Toc226928506 \h </w:instrText>
+              <w:instrText xml:space="preserve"> PAGEREF _Toc227703686 \h </w:instrText>
             </w:r>
             <w:r>
               <w:rPr>
@@ -805,11 +805,11 @@
               <w:kern w:val="2"/>
               <w:sz w:val="24"/>
               <w:szCs w:val="24"/>
-              <w:lang w:val="es-MX" w:eastAsia="es-MX"/>
+              <w:lang w:val="en-US"/>
               <w14:ligatures w14:val="standardContextual"/>
             </w:rPr>
           </w:pPr>
-          <w:hyperlink w:anchor="_Toc226928507" w:history="1">
+          <w:hyperlink w:anchor="_Toc227703687" w:history="1">
             <w:r>
               <w:rPr>
                 <w:rStyle w:val="Hipervnculo"/>
@@ -828,7 +828,7 @@
                 <w:kern w:val="2"/>
                 <w:sz w:val="24"/>
                 <w:szCs w:val="24"/>
-                <w:lang w:val="es-MX" w:eastAsia="es-MX"/>
+                <w:lang w:val="en-US"/>
                 <w14:ligatures w14:val="standardContextual"/>
               </w:rPr>
               <w:tab/>
@@ -863,7 +863,7 @@
                 <w:noProof/>
                 <w:webHidden/>
               </w:rPr>
-              <w:instrText xml:space="preserve"> PAGEREF _Toc226928507 \h </w:instrText>
+              <w:instrText xml:space="preserve"> PAGEREF _Toc227703687 \h </w:instrText>
             </w:r>
             <w:r>
               <w:rPr>
@@ -907,11 +907,11 @@
               <w:kern w:val="2"/>
               <w:sz w:val="24"/>
               <w:szCs w:val="24"/>
-              <w:lang w:val="es-MX" w:eastAsia="es-MX"/>
+              <w:lang w:val="en-US"/>
               <w14:ligatures w14:val="standardContextual"/>
             </w:rPr>
           </w:pPr>
-          <w:hyperlink w:anchor="_Toc226928508" w:history="1">
+          <w:hyperlink w:anchor="_Toc227703688" w:history="1">
             <w:r>
               <w:rPr>
                 <w:rStyle w:val="Hipervnculo"/>
@@ -930,7 +930,7 @@
                 <w:kern w:val="2"/>
                 <w:sz w:val="24"/>
                 <w:szCs w:val="24"/>
-                <w:lang w:val="es-MX" w:eastAsia="es-MX"/>
+                <w:lang w:val="en-US"/>
                 <w14:ligatures w14:val="standardContextual"/>
               </w:rPr>
               <w:tab/>
@@ -965,7 +965,7 @@
                 <w:noProof/>
                 <w:webHidden/>
               </w:rPr>
-              <w:instrText xml:space="preserve"> PAGEREF _Toc226928508 \h </w:instrText>
+              <w:instrText xml:space="preserve"> PAGEREF _Toc227703688 \h </w:instrText>
             </w:r>
             <w:r>
               <w:rPr>
@@ -1009,11 +1009,11 @@
               <w:kern w:val="2"/>
               <w:sz w:val="24"/>
               <w:szCs w:val="24"/>
-              <w:lang w:val="es-MX" w:eastAsia="es-MX"/>
+              <w:lang w:val="en-US"/>
               <w14:ligatures w14:val="standardContextual"/>
             </w:rPr>
           </w:pPr>
-          <w:hyperlink w:anchor="_Toc226928509" w:history="1">
+          <w:hyperlink w:anchor="_Toc227703689" w:history="1">
             <w:r>
               <w:rPr>
                 <w:rStyle w:val="Hipervnculo"/>
@@ -1032,7 +1032,7 @@
                 <w:kern w:val="2"/>
                 <w:sz w:val="24"/>
                 <w:szCs w:val="24"/>
-                <w:lang w:val="es-MX" w:eastAsia="es-MX"/>
+                <w:lang w:val="en-US"/>
                 <w14:ligatures w14:val="standardContextual"/>
               </w:rPr>
               <w:tab/>
@@ -1067,7 +1067,7 @@
                 <w:noProof/>
                 <w:webHidden/>
               </w:rPr>
-              <w:instrText xml:space="preserve"> PAGEREF _Toc226928509 \h </w:instrText>
+              <w:instrText xml:space="preserve"> PAGEREF _Toc227703689 \h </w:instrText>
             </w:r>
             <w:r>
               <w:rPr>
@@ -1087,7 +1087,7 @@
                 <w:noProof/>
                 <w:webHidden/>
               </w:rPr>
-              <w:t>5</w:t>
+              <w:t>6</w:t>
             </w:r>
             <w:r>
               <w:rPr>
@@ -1111,11 +1111,11 @@
               <w:kern w:val="2"/>
               <w:sz w:val="24"/>
               <w:szCs w:val="24"/>
-              <w:lang w:val="es-MX" w:eastAsia="es-MX"/>
+              <w:lang w:val="en-US"/>
               <w14:ligatures w14:val="standardContextual"/>
             </w:rPr>
           </w:pPr>
-          <w:hyperlink w:anchor="_Toc226928510" w:history="1">
+          <w:hyperlink w:anchor="_Toc227703690" w:history="1">
             <w:r>
               <w:rPr>
                 <w:rStyle w:val="Hipervnculo"/>
@@ -1134,7 +1134,7 @@
                 <w:kern w:val="2"/>
                 <w:sz w:val="24"/>
                 <w:szCs w:val="24"/>
-                <w:lang w:val="es-MX" w:eastAsia="es-MX"/>
+                <w:lang w:val="en-US"/>
                 <w14:ligatures w14:val="standardContextual"/>
               </w:rPr>
               <w:tab/>
@@ -1169,82 +1169,7 @@
                 <w:noProof/>
                 <w:webHidden/>
               </w:rPr>
-              <w:instrText xml:space="preserve"> PAGEREF _Toc226928510 \h </w:instrText>
-            </w:r>
-            <w:r>
-              <w:rPr>
-                <w:noProof/>
-                <w:webHidden/>
-              </w:rPr>
-            </w:r>
-            <w:r>
-              <w:rPr>
-                <w:noProof/>
-                <w:webHidden/>
-              </w:rPr>
-              <w:fldChar w:fldCharType="separate"/>
-            </w:r>
-            <w:r>
-              <w:rPr>
-                <w:noProof/>
-                <w:webHidden/>
-              </w:rPr>
-              <w:t>6</w:t>
-            </w:r>
-            <w:r>
-              <w:rPr>
-                <w:noProof/>
-                <w:webHidden/>
-              </w:rPr>
-              <w:fldChar w:fldCharType="end"/>
-            </w:r>
-          </w:hyperlink>
-        </w:p>
-        <w:p>
-          <w:pPr>
-            <w:pStyle w:val="TDC1"/>
-            <w:tabs>
-              <w:tab w:val="right" w:leader="dot" w:pos="9350"/>
-            </w:tabs>
-            <w:rPr>
-              <w:rFonts w:asciiTheme="minorHAnsi" w:eastAsiaTheme="minorEastAsia" w:hAnsiTheme="minorHAnsi" w:cstheme="minorBidi"/>
-              <w:noProof/>
-              <w:kern w:val="2"/>
-              <w:sz w:val="24"/>
-              <w:szCs w:val="24"/>
-              <w:lang w:val="es-MX" w:eastAsia="es-MX"/>
-              <w14:ligatures w14:val="standardContextual"/>
-            </w:rPr>
-          </w:pPr>
-          <w:hyperlink w:anchor="_Toc226928511" w:history="1">
-            <w:r>
-              <w:rPr>
-                <w:rStyle w:val="Hipervnculo"/>
-                <w:noProof/>
-                <w:lang w:val="es-MX"/>
-              </w:rPr>
-              <w:t>Bibliografía</w:t>
-            </w:r>
-            <w:r>
-              <w:rPr>
-                <w:noProof/>
-                <w:webHidden/>
-              </w:rPr>
-              <w:tab/>
-            </w:r>
-            <w:r>
-              <w:rPr>
-                <w:noProof/>
-                <w:webHidden/>
-              </w:rPr>
-              <w:fldChar w:fldCharType="begin"/>
-            </w:r>
-            <w:r>
-              <w:rPr>
-                <w:noProof/>
-                <w:webHidden/>
-              </w:rPr>
-              <w:instrText xml:space="preserve"> PAGEREF _Toc226928511 \h </w:instrText>
+              <w:instrText xml:space="preserve"> PAGEREF _Toc227703690 \h </w:instrText>
             </w:r>
             <w:r>
               <w:rPr>
@@ -1276,6 +1201,81 @@
           </w:hyperlink>
         </w:p>
         <w:p>
+          <w:pPr>
+            <w:pStyle w:val="TDC1"/>
+            <w:tabs>
+              <w:tab w:val="right" w:leader="dot" w:pos="9350"/>
+            </w:tabs>
+            <w:rPr>
+              <w:rFonts w:asciiTheme="minorHAnsi" w:eastAsiaTheme="minorEastAsia" w:hAnsiTheme="minorHAnsi" w:cstheme="minorBidi"/>
+              <w:noProof/>
+              <w:kern w:val="2"/>
+              <w:sz w:val="24"/>
+              <w:szCs w:val="24"/>
+              <w:lang w:val="en-US"/>
+              <w14:ligatures w14:val="standardContextual"/>
+            </w:rPr>
+          </w:pPr>
+          <w:hyperlink w:anchor="_Toc227703691" w:history="1">
+            <w:r>
+              <w:rPr>
+                <w:rStyle w:val="Hipervnculo"/>
+                <w:noProof/>
+                <w:lang w:val="es-MX"/>
+              </w:rPr>
+              <w:t>Bibliografía</w:t>
+            </w:r>
+            <w:r>
+              <w:rPr>
+                <w:noProof/>
+                <w:webHidden/>
+              </w:rPr>
+              <w:tab/>
+            </w:r>
+            <w:r>
+              <w:rPr>
+                <w:noProof/>
+                <w:webHidden/>
+              </w:rPr>
+              <w:fldChar w:fldCharType="begin"/>
+            </w:r>
+            <w:r>
+              <w:rPr>
+                <w:noProof/>
+                <w:webHidden/>
+              </w:rPr>
+              <w:instrText xml:space="preserve"> PAGEREF _Toc227703691 \h </w:instrText>
+            </w:r>
+            <w:r>
+              <w:rPr>
+                <w:noProof/>
+                <w:webHidden/>
+              </w:rPr>
+            </w:r>
+            <w:r>
+              <w:rPr>
+                <w:noProof/>
+                <w:webHidden/>
+              </w:rPr>
+              <w:fldChar w:fldCharType="separate"/>
+            </w:r>
+            <w:r>
+              <w:rPr>
+                <w:noProof/>
+                <w:webHidden/>
+              </w:rPr>
+              <w:t>8</w:t>
+            </w:r>
+            <w:r>
+              <w:rPr>
+                <w:noProof/>
+                <w:webHidden/>
+              </w:rPr>
+              <w:fldChar w:fldCharType="end"/>
+            </w:r>
+          </w:hyperlink>
+        </w:p>
+        <w:p>
           <w:r>
             <w:rPr>
               <w:b/>
@@ -1299,7 +1299,7 @@
           <w:lang w:val="es-MX"/>
         </w:rPr>
       </w:pPr>
-      <w:bookmarkStart w:id="1" w:name="_Toc226928504"/>
+      <w:bookmarkStart w:id="1" w:name="_Toc227703684"/>
       <w:r>
         <w:rPr>
           <w:rFonts w:ascii="Proxima Nova" w:hAnsi="Proxima Nova"/>
@@ -1446,7 +1446,7 @@
           <w:lang w:val="es-MX"/>
         </w:rPr>
       </w:pPr>
-      <w:bookmarkStart w:id="2" w:name="_Toc226928505"/>
+      <w:bookmarkStart w:id="2" w:name="_Toc227703685"/>
       <w:bookmarkEnd w:id="0"/>
       <w:r>
         <w:rPr>
@@ -1764,6 +1764,7 @@
       </w:pPr>
       <w:r>
         <w:rPr>
+          <w:noProof/>
           <w:sz w:val="24"/>
           <w:szCs w:val="24"/>
         </w:rPr>
@@ -1820,7 +1821,7 @@
           <w:lang w:val="es-MX"/>
         </w:rPr>
       </w:pPr>
-      <w:bookmarkStart w:id="3" w:name="_Toc226928506"/>
+      <w:bookmarkStart w:id="3" w:name="_Toc227703686"/>
       <w:r>
         <w:rPr>
           <w:rFonts w:ascii="Proxima Nova" w:hAnsi="Proxima Nova"/>
@@ -1970,6 +1971,7 @@
       </w:pPr>
       <w:r>
         <w:rPr>
+          <w:noProof/>
           <w:sz w:val="24"/>
           <w:szCs w:val="24"/>
         </w:rPr>
@@ -2027,7 +2029,7 @@
           <w:lang w:val="es-MX"/>
         </w:rPr>
       </w:pPr>
-      <w:bookmarkStart w:id="4" w:name="_Toc226928507"/>
+      <w:bookmarkStart w:id="4" w:name="_Toc227703687"/>
       <w:r>
         <w:rPr>
           <w:rFonts w:ascii="Proxima Nova" w:hAnsi="Proxima Nova"/>
@@ -2266,6 +2268,7 @@
           <w:rFonts w:ascii="Proxima Nova" w:hAnsi="Proxima Nova"/>
           <w:b/>
           <w:bCs/>
+          <w:noProof/>
           <w:sz w:val="28"/>
           <w:szCs w:val="28"/>
           <w:lang w:val="es-MX"/>
@@ -2324,7 +2327,7 @@
           <w:lang w:val="es-MX"/>
         </w:rPr>
       </w:pPr>
-      <w:bookmarkStart w:id="5" w:name="_Toc226928508"/>
+      <w:bookmarkStart w:id="5" w:name="_Toc227703688"/>
       <w:r>
         <w:rPr>
           <w:rFonts w:ascii="Proxima Nova" w:hAnsi="Proxima Nova"/>
@@ -2608,6 +2611,7 @@
           <w:rFonts w:ascii="Proxima Nova" w:hAnsi="Proxima Nova"/>
           <w:b/>
           <w:bCs/>
+          <w:noProof/>
           <w:sz w:val="28"/>
           <w:szCs w:val="28"/>
           <w:lang w:val="es-MX"/>
@@ -2666,7 +2670,7 @@
           <w:lang w:val="es-MX"/>
         </w:rPr>
       </w:pPr>
-      <w:bookmarkStart w:id="6" w:name="_Toc226928509"/>
+      <w:bookmarkStart w:id="6" w:name="_Toc227703689"/>
       <w:r>
         <w:rPr>
           <w:rFonts w:ascii="Proxima Nova" w:hAnsi="Proxima Nova"/>
@@ -2919,6 +2923,7 @@
           <w:rFonts w:ascii="Proxima Nova" w:hAnsi="Proxima Nova"/>
           <w:b/>
           <w:bCs/>
+          <w:noProof/>
           <w:sz w:val="28"/>
           <w:szCs w:val="28"/>
           <w:lang w:val="es-MX"/>
@@ -2977,7 +2982,7 @@
           <w:lang w:val="es-MX"/>
         </w:rPr>
       </w:pPr>
-      <w:bookmarkStart w:id="7" w:name="_Toc226928510"/>
+      <w:bookmarkStart w:id="7" w:name="_Toc227703690"/>
       <w:r>
         <w:rPr>
           <w:rFonts w:ascii="Proxima Nova" w:hAnsi="Proxima Nova"/>
@@ -3240,6 +3245,7 @@
           <w:rFonts w:ascii="Proxima Nova" w:hAnsi="Proxima Nova"/>
           <w:b/>
           <w:bCs/>
+          <w:noProof/>
           <w:sz w:val="28"/>
           <w:szCs w:val="28"/>
           <w:lang w:val="es-MX"/>
@@ -3355,7 +3361,7 @@
           <w:lang w:val="es-MX"/>
         </w:rPr>
       </w:pPr>
-      <w:bookmarkStart w:id="8" w:name="_Toc226928511"/>
+      <w:bookmarkStart w:id="8" w:name="_Toc227703691"/>
       <w:r>
         <w:rPr>
           <w:sz w:val="36"/>
@@ -3400,16 +3406,23 @@
         <w:t>, Sep. 20, 2023. https://learnsql.es/blog/20-ejemplos-de-consultas-sql-basicas-para-principiantes-una-vision-completa/</w:t>
       </w:r>
       <w:r>
+        <w:rPr>
+          <w:lang w:val="es-MX"/>
+        </w:rPr>
         <w:t xml:space="preserve">P. J. Deitel and H. M. Deitel, </w:t>
       </w:r>
       <w:r>
         <w:rPr>
           <w:i/>
           <w:iCs/>
+          <w:lang w:val="es-MX"/>
         </w:rPr>
         <w:t>Java: How to Program</w:t>
       </w:r>
       <w:r>
+        <w:rPr>
+          <w:lang w:val="es-MX"/>
+        </w:rPr>
         <w:t xml:space="preserve">. </w:t>
       </w:r>
       <w:r>
@@ -3446,24 +3459,23 @@
         </w:rPr>
       </w:pPr>
       <w:r>
-        <w:t xml:space="preserve">J. M. Alarcón, “TUTORIAL SQL #3: Consultas SELECT </w:t>
-      </w:r>
-      <w:proofErr w:type="spellStart"/>
-      <w:r>
-        <w:t>multi-tabla</w:t>
-      </w:r>
-      <w:proofErr w:type="spellEnd"/>
-      <w:r>
-        <w:t xml:space="preserve"> básicas - JOIN - campusMVP.es,” </w:t>
+        <w:rPr>
+          <w:lang w:val="es-MX"/>
+        </w:rPr>
+        <w:t>J. M. Alarcón, “TUTORIAL SQL #3: Consultas SELECT multi-tabla básicas - JOIN - campusMVP.es,” </w:t>
       </w:r>
       <w:r>
         <w:rPr>
           <w:i/>
           <w:iCs/>
+          <w:lang w:val="es-MX"/>
         </w:rPr>
         <w:t>campusMVP.es</w:t>
       </w:r>
       <w:r>
+        <w:rPr>
+          <w:lang w:val="es-MX"/>
+        </w:rPr>
         <w:t>, Nov. 08, 2021. https://www.campusmvp.es/recursos/post/Fundamentos-de-SQL-Consultas-SELECT-multi-tabla-JOIN.aspx?srsltid=AfmBOopskdiflcUrK1YPlKBgu3YU_Pp8I4vbFXceZg4CPHaEj1YiFixS</w:t>
       </w:r>
     </w:p>
@@ -8377,6 +8389,7 @@
   <w:style w:type="character" w:default="1" w:styleId="Fuentedeprrafopredeter">
     <w:name w:val="Default Paragraph Font"/>
     <w:uiPriority w:val="1"/>
+    <w:semiHidden/>
     <w:unhideWhenUsed/>
   </w:style>
   <w:style w:type="table" w:default="1" w:styleId="Tablanormal">

</xml_diff>